<commit_message>
BPP submission: move figures/tables after references, ASCII punctuation, renamed PNGs in zip
Co-Authored-By: Tatsuki Onishi <bougtoir@gmail.com>
</commit_message>
<xml_diff>
--- a/medical_accident_its_analysis/manuscript/bpp_cover_letter.docx
+++ b/medical_accident_its_analysis/manuscript/bpp_cover_letter.docx
@@ -79,7 +79,7 @@
           <w:rFonts w:ascii="Times New Roman" w:hAnsi="Times New Roman"/>
           <w:sz w:val="22"/>
         </w:rPr>
-        <w:t>Behavioural Public Policy advances rigorous, multidisciplinary research that connects the study of human behaviour to public policy. Our study sits squarely within this agenda. It uses a well-documented healthcare workforce problem—specialty maldistribution—as a policy test case and asks whether a salient, emotionally available risk (malpractice litigation) actually changes aggregate career behaviour. Using national administrative data from Japan, we find no association between litigation risk and specialty physician supply, and we bound any effect within a small equivalence margin. The result is informative for behavioural public policy because it shows that a widely perceived risk need not translate into a policy lever when structural incentives, switching costs and status-quo bias constrain individual choice.</w:t>
+        <w:t>Behavioural Public Policy advances rigorous, multidisciplinary research that connects the study of human behaviour to public policy. Our study sits squarely within this agenda. It uses a well-documented healthcare workforce problem -- specialty maldistribution -- as a policy test case and asks whether a salient, emotionally available risk (malpractice litigation) actually changes aggregate career behaviour. Using national administrative data from Japan, we find no association between litigation risk and specialty physician supply, and we bound any effect within a small equivalence margin. The result is informative for behavioural public policy because it shows that a widely perceived risk need not translate into a policy lever when structural incentives, switching costs and status-quo bias constrain individual choice.</w:t>
       </w:r>
     </w:p>
     <w:p>
@@ -91,7 +91,7 @@
           <w:rFonts w:ascii="Times New Roman" w:hAnsi="Times New Roman"/>
           <w:sz w:val="22"/>
         </w:rPr>
-        <w:t>The behavioural contribution is threefold. First, we show how two common observational fallacies—size confounding in raw administrative counts and interpolation of sparse panel data—can distort the evidence base for a behavioural policy lever. Second, we combine fixed-effects panel methods, equivalence testing, cluster block-bootstrap and power diagnostics to produce an informative null result rather than a mere failure to reject the null. Third, we interpret the null through the lens of behavioural economics: availability, loss aversion and status-quo bias explain why perceived litigation risk can be high while aggregate workforce response is negligible.</w:t>
+        <w:t>The behavioural contribution is threefold. First, we show how two common observational fallacies -- size confounding in raw administrative counts and interpolation of sparse panel data -- can distort the evidence base for a behavioural policy lever. Second, we combine fixed-effects panel methods, equivalence testing, cluster block-bootstrap and power diagnostics to produce an informative null result rather than a mere failure to reject the null. Third, we interpret the null through the lens of behavioural economics: availability, loss aversion and status-quo bias explain why perceived litigation risk can be high while aggregate workforce response is negligible.</w:t>
       </w:r>
     </w:p>
     <w:p>

</xml_diff>

<commit_message>
BPP submission: separate figures, ASCII sanitise, address reviewer checklist
- Remove embedded figures from bpp_manuscript_en.docx; captions only in back matter per Cambridge BPP guidance.

- Expand ASCII sanitisation for Office XML (>=, <=, x, punctuation, theme fonts).

- Align reference-list authors with in-text abbreviations for JOCS-CP and JMSR.

- Correct Introduction specialty example to data-included field.

- Regenerate all BPP docx/pptx/zip outputs from make all pipeline.

Co-Authored-By: Tatsuki Onishi <bougtoir@gmail.com>
</commit_message>
<xml_diff>
--- a/medical_accident_its_analysis/manuscript/bpp_cover_letter.docx
+++ b/medical_accident_its_analysis/manuscript/bpp_cover_letter.docx
@@ -79,7 +79,7 @@
           <w:rFonts w:ascii="Times New Roman" w:hAnsi="Times New Roman"/>
           <w:sz w:val="22"/>
         </w:rPr>
-        <w:t>Behavioural Public Policy advances rigorous, multidisciplinary research that connects the study of human behaviour to public policy. Our study sits squarely within this agenda. It uses a well-documented healthcare workforce problem -- specialty maldistribution -- as a policy test case and asks whether a salient, emotionally available risk (malpractice litigation) actually changes aggregate career behaviour. Using national administrative data from Japan, we find no association between litigation risk and specialty physician supply, and we bound any effect within a small equivalence margin. The result is informative for behavioural public policy because it shows that a widely perceived risk need not translate into a policy lever when structural incentives, switching costs and status-quo bias constrain individual choice.</w:t>
+        <w:t>Behavioural Public Policy advances rigorous, multidisciplinary research that connects the study of human behaviour to public policy. Our study sits squarely within this agenda. It uses a well-documented healthcare workforce problem -- specialty maldistribution -- as a policy test case and asks whether a salient, cognitively available risk (malpractice litigation) actually changes aggregate career behaviour. Using national administrative data from Japan, we find no association between litigation risk and specialty physician supply, and we bound any effect within a small equivalence margin. The result is informative for behavioural public policy because it shows that a widely perceived risk need not translate into a policy lever when structural incentives, switching costs and status-quo bias constrain individual choice.</w:t>
       </w:r>
     </w:p>
     <w:p>
@@ -226,7 +226,7 @@
     <w:lvl w:ilvl="0">
       <w:start w:val="1"/>
       <w:numFmt w:val="bullet"/>
-      <w:lvlText w:val=""/>
+      <w:lvlText w:val="*"/>
       <w:lvlJc w:val="left"/>
       <w:pPr>
         <w:tabs>
@@ -247,7 +247,7 @@
       <w:start w:val="1"/>
       <w:numFmt w:val="bullet"/>
       <w:pStyle w:val="ListBullet3"/>
-      <w:lvlText w:val=""/>
+      <w:lvlText w:val="*"/>
       <w:lvlJc w:val="left"/>
       <w:pPr>
         <w:tabs>
@@ -268,7 +268,7 @@
       <w:start w:val="1"/>
       <w:numFmt w:val="bullet"/>
       <w:pStyle w:val="ListBullet2"/>
-      <w:lvlText w:val=""/>
+      <w:lvlText w:val="*"/>
       <w:lvlJc w:val="left"/>
       <w:pPr>
         <w:tabs>
@@ -307,7 +307,7 @@
       <w:start w:val="1"/>
       <w:numFmt w:val="bullet"/>
       <w:pStyle w:val="ListBullet"/>
-      <w:lvlText w:val=""/>
+      <w:lvlText w:val="*"/>
       <w:lvlJc w:val="left"/>
       <w:pPr>
         <w:tabs>
@@ -24051,10 +24051,10 @@
         <a:latin typeface="Calibri"/>
         <a:ea typeface=""/>
         <a:cs typeface=""/>
-        <a:font script="Jpan" typeface="ＭＳ ゴシック"/>
-        <a:font script="Hang" typeface="맑은 고딕"/>
-        <a:font script="Hans" typeface="宋体"/>
-        <a:font script="Hant" typeface="新細明體"/>
+        <a:font script="Jpan" typeface="MS Gothic"/>
+        <a:font script="Hang" typeface="Malgun Gothic"/>
+        <a:font script="Hans" typeface="SimSun"/>
+        <a:font script="Hant" typeface="PMingLiU"/>
         <a:font script="Arab" typeface="Times New Roman"/>
         <a:font script="Hebr" typeface="Times New Roman"/>
         <a:font script="Thai" typeface="Angsana New"/>
@@ -24086,10 +24086,10 @@
         <a:latin typeface="Cambria"/>
         <a:ea typeface=""/>
         <a:cs typeface=""/>
-        <a:font script="Jpan" typeface="ＭＳ 明朝"/>
-        <a:font script="Hang" typeface="맑은 고딕"/>
-        <a:font script="Hans" typeface="宋体"/>
-        <a:font script="Hant" typeface="新細明體"/>
+        <a:font script="Jpan" typeface="MS Mincho"/>
+        <a:font script="Hang" typeface="Malgun Gothic"/>
+        <a:font script="Hans" typeface="SimSun"/>
+        <a:font script="Hant" typeface="PMingLiU"/>
         <a:font script="Arab" typeface="Arial"/>
         <a:font script="Hebr" typeface="Arial"/>
         <a:font script="Thai" typeface="Cordia New"/>

</xml_diff>

<commit_message>
BPP revision: add margin justification, clarify hospital facility counts, simplify Discussion, add 2017 source note, anonymised URL placeholder
Co-Authored-By: Tatsuki Onishi <bougtoir@gmail.com>
</commit_message>
<xml_diff>
--- a/medical_accident_its_analysis/manuscript/bpp_cover_letter.docx
+++ b/medical_accident_its_analysis/manuscript/bpp_cover_letter.docx
@@ -67,7 +67,7 @@
           <w:rFonts w:ascii="Times New Roman" w:hAnsi="Times New Roman"/>
           <w:sz w:val="22"/>
         </w:rPr>
-        <w:t>We submit an original research article, "Litigation risk and physician specialty supply: a Japanese test of behavioural risk perception", for consideration by Behavioural Public Policy.</w:t>
+        <w:t>We submit an original research article, "Risk perception versus structural incentives in physician specialty choice: a Japanese panel study", for consideration by Behavioural Public Policy.</w:t>
       </w:r>
     </w:p>
     <w:p>
@@ -103,7 +103,7 @@
           <w:rFonts w:ascii="Times New Roman" w:hAnsi="Times New Roman"/>
           <w:sz w:val="22"/>
         </w:rPr>
-        <w:t>The national administrative data we use come from Japan, a setting that provides a complete, long-running test case. The analysis is fully reproducible from openly available primary files and code in the project repository (https://github.com/bougtoir/medical-accident-its-analysis). We believe the manuscript will be of interest to behavioural economists, health policy scholars, and public-policy analysts concerned with how risk perception and institutional incentives shape workforce behaviour.</w:t>
+        <w:t>The national administrative data we use come from Japan, a setting that provides a complete, long-running test case. The analysis is fully reproducible from openly available primary files and code in the project repository ([anonymous GitHub repository URL to be supplied]). We believe the manuscript will be of interest to behavioural economists, health policy scholars, and public-policy analysts concerned with how risk perception and institutional incentives shape workforce behaviour.</w:t>
       </w:r>
     </w:p>
     <w:p>

</xml_diff>

<commit_message>
BPP: address reviewer concerns 1-4 (abstract 155 words, Harvard ref style with quotes/sentence case/place-publisher, lever/robust/actually wording, 300 dpi PNG+TIFF in zip)
Co-Authored-By: Tatsuki Onishi <bougtoir@gmail.com>
</commit_message>
<xml_diff>
--- a/medical_accident_its_analysis/manuscript/bpp_cover_letter.docx
+++ b/medical_accident_its_analysis/manuscript/bpp_cover_letter.docx
@@ -79,7 +79,7 @@
           <w:rFonts w:ascii="Times New Roman" w:hAnsi="Times New Roman"/>
           <w:sz w:val="22"/>
         </w:rPr>
-        <w:t>Behavioural Public Policy advances rigorous, multidisciplinary research that connects the study of human behaviour to public policy. Our study sits squarely within this agenda. It uses a well-documented healthcare workforce problem -- specialty maldistribution -- as a policy test case and asks whether a salient, cognitively available risk (malpractice litigation) actually changes aggregate career behaviour. Using national administrative data from Japan, we find no association between litigation risk and specialty physician supply, and we bound any effect within a small equivalence margin. The result is informative for behavioural public policy because it shows that a widely perceived risk need not translate into a policy lever when structural incentives, switching costs and status-quo bias constrain individual choice.</w:t>
+        <w:t>Behavioural Public Policy advances rigorous, multidisciplinary research that connects the study of human behaviour to public policy. Our study sits squarely within this agenda. It uses a well-documented healthcare workforce problem -- specialty maldistribution -- as a policy test case and asks whether a salient, cognitively available risk (malpractice litigation) changes aggregate career behaviour. Using national administrative data from Japan, we find no association between litigation risk and specialty physician supply, and we bound any effect within a small equivalence margin. The result is informative for behavioural public policy because it shows that a widely perceived risk need not translate into a policy tool when structural incentives, switching costs and status-quo bias constrain individual choice.</w:t>
       </w:r>
     </w:p>
     <w:p>
@@ -91,7 +91,7 @@
           <w:rFonts w:ascii="Times New Roman" w:hAnsi="Times New Roman"/>
           <w:sz w:val="22"/>
         </w:rPr>
-        <w:t>The behavioural contribution is threefold. First, we show how two common observational fallacies -- size confounding in raw administrative counts and interpolation of sparse panel data -- can distort the evidence base for a behavioural policy lever. Second, we combine fixed-effects panel methods, equivalence testing, cluster block-bootstrap and power diagnostics to produce an informative null result rather than a mere failure to reject the null. Third, we interpret the null through the lens of behavioural economics: availability, loss aversion and status-quo bias explain why perceived litigation risk can be high while aggregate workforce response is negligible.</w:t>
+        <w:t>The behavioural contribution is threefold. First, we show how two common observational fallacies -- size confounding in raw administrative counts and interpolation of sparse panel data -- can distort the evidence base for a behavioural policy tool. Second, we combine fixed-effects panel methods, equivalence testing, cluster block-bootstrap and power diagnostics to produce an informative null result rather than a mere failure to reject the null. Third, we interpret the null through the lens of behavioural economics: availability, loss aversion and status-quo bias explain why perceived litigation risk can be high while aggregate workforce response is negligible.</w:t>
       </w:r>
     </w:p>
     <w:p>

</xml_diff>